<commit_message>
chore: repo cleanup — fix links, remove GFM duplicates, disable dead workflows, add styled templates
Summary of changes:
- Fix 13 broken .md cross-references in .qmd files → updated to .qmd
- Remove 13 GFM duplicate files (docs/*-gfm.qmd variants)
- Disable 12 legacy/redundant workflows (set to workflow_dispatch only)
  - ai-security-audit, canon-validation, ci, deploy, drift-detection,
    generate-artifacts, generate-docs, generate_artifacts, lint,
    render-and-insert-diagrams, publish, push-adapters-workflow
  - rename-visuals annotated as deprecated (already workflow_dispatch)
- Replace data/docx-reference.docx with styled Microsoft Learn template
  (Calibri, navy headings, styled code blocks, table headers)
- Replace data/pptx-reference.pptx with styled branded template
  (16:9, navy bars, teal accents, 5 slide layouts)
</commit_message>
<xml_diff>
--- a/data/docx-reference.docx
+++ b/data/docx-reference.docx
@@ -2,9 +2,231 @@
 <file path=word/document.xml><?xml version="1.0" encoding="utf-8"?>
 <w:document xmlns:wpc="http://schemas.microsoft.com/office/word/2010/wordprocessingCanvas" xmlns:mo="http://schemas.microsoft.com/office/mac/office/2008/main" xmlns:mc="http://schemas.openxmlformats.org/markup-compatibility/2006" xmlns:mv="urn:schemas-microsoft-com:mac:vml" xmlns:o="urn:schemas-microsoft-com:office:office" xmlns:r="http://schemas.openxmlformats.org/officeDocument/2006/relationships" xmlns:m="http://schemas.openxmlformats.org/officeDocument/2006/math" xmlns:v="urn:schemas-microsoft-com:vml" xmlns:wp14="http://schemas.microsoft.com/office/word/2010/wordprocessingDrawing" xmlns:wp="http://schemas.openxmlformats.org/drawingml/2006/wordprocessingDrawing" xmlns:w10="urn:schemas-microsoft-com:office:word" xmlns:w="http://schemas.openxmlformats.org/wordprocessingml/2006/main" xmlns:w14="http://schemas.microsoft.com/office/word/2010/wordml" xmlns:wpg="http://schemas.microsoft.com/office/word/2010/wordprocessingGroup" xmlns:wpi="http://schemas.microsoft.com/office/word/2010/wordprocessingInk" xmlns:wne="http://schemas.microsoft.com/office/word/2006/wordml" xmlns:wps="http://schemas.microsoft.com/office/word/2010/wordprocessingShape" mc:Ignorable="w14 wp14">
   <w:body>
+    <w:p>
+      <w:pPr>
+        <w:pStyle w:val="Title"/>
+      </w:pPr>
+      <w:r>
+        <w:t>UIAO Documentation</w:t>
+      </w:r>
+    </w:p>
+    <w:p>
+      <w:pPr>
+        <w:pStyle w:val="Subtitle"/>
+      </w:pPr>
+      <w:r>
+        <w:t>Unified Identity-Addressing-Overlay Architecture</w:t>
+      </w:r>
+    </w:p>
+    <w:p>
+      <w:pPr>
+        <w:pStyle w:val="Heading1"/>
+      </w:pPr>
+      <w:r>
+        <w:t>Section Heading 1</w:t>
+      </w:r>
+    </w:p>
+    <w:p>
+      <w:r>
+        <w:t>Body text in Calibri 11pt. This template follows the Microsoft Learn visual style with bold navy headings, clean spacing, and professional typography.</w:t>
+      </w:r>
+    </w:p>
+    <w:p>
+      <w:pPr>
+        <w:pStyle w:val="Heading2"/>
+      </w:pPr>
+      <w:r>
+        <w:t>Section Heading 2</w:t>
+      </w:r>
+    </w:p>
+    <w:p>
+      <w:r>
+        <w:t>Subsection content with proper spacing and hierarchy.</w:t>
+      </w:r>
+    </w:p>
+    <w:p>
+      <w:pPr>
+        <w:pStyle w:val="Heading3"/>
+      </w:pPr>
+      <w:r>
+        <w:t>Section Heading 3</w:t>
+      </w:r>
+    </w:p>
+    <w:p>
+      <w:r>
+        <w:t>Third-level heading in lighter blue.</w:t>
+      </w:r>
+    </w:p>
+    <w:tbl>
+      <w:tblPr>
+        <w:tblStyle w:val="TableGrid"/>
+        <w:tblW w:type="auto" w:w="0"/>
+        <w:tblLook w:firstColumn="1" w:firstRow="1" w:lastColumn="0" w:lastRow="0" w:noHBand="0" w:noVBand="1" w:val="04A0"/>
+      </w:tblPr>
+      <w:tblGrid>
+        <w:gridCol w:w="3120"/>
+        <w:gridCol w:w="3120"/>
+        <w:gridCol w:w="3120"/>
+      </w:tblGrid>
+      <w:tr>
+        <w:tc>
+          <w:tcPr>
+            <w:tcW w:type="dxa" w:w="3120"/>
+            <w:shd w:fill="003B6F" w:val="clear"/>
+          </w:tcPr>
+          <w:p>
+            <w:r>
+              <w:rPr>
+                <w:rFonts w:ascii="Calibri" w:hAnsi="Calibri"/>
+                <w:b/>
+                <w:color w:val="FFFFFF"/>
+                <w:sz w:val="20"/>
+              </w:rPr>
+              <w:t>Component</w:t>
+            </w:r>
+          </w:p>
+        </w:tc>
+        <w:tc>
+          <w:tcPr>
+            <w:tcW w:type="dxa" w:w="3120"/>
+            <w:shd w:fill="003B6F" w:val="clear"/>
+          </w:tcPr>
+          <w:p>
+            <w:r>
+              <w:rPr>
+                <w:rFonts w:ascii="Calibri" w:hAnsi="Calibri"/>
+                <w:b/>
+                <w:color w:val="FFFFFF"/>
+                <w:sz w:val="20"/>
+              </w:rPr>
+              <w:t>Control Plane</w:t>
+            </w:r>
+          </w:p>
+        </w:tc>
+        <w:tc>
+          <w:tcPr>
+            <w:tcW w:type="dxa" w:w="3120"/>
+            <w:shd w:fill="003B6F" w:val="clear"/>
+          </w:tcPr>
+          <w:p>
+            <w:r>
+              <w:rPr>
+                <w:rFonts w:ascii="Calibri" w:hAnsi="Calibri"/>
+                <w:b/>
+                <w:color w:val="FFFFFF"/>
+                <w:sz w:val="20"/>
+              </w:rPr>
+              <w:t>NIST Control</w:t>
+            </w:r>
+          </w:p>
+        </w:tc>
+      </w:tr>
+      <w:tr>
+        <w:tc>
+          <w:tcPr>
+            <w:tcW w:type="dxa" w:w="3120"/>
+          </w:tcPr>
+          <w:p>
+            <w:r>
+              <w:rPr>
+                <w:rFonts w:ascii="Calibri" w:hAnsi="Calibri"/>
+                <w:color w:val="333333"/>
+                <w:sz w:val="20"/>
+              </w:rPr>
+              <w:t>Entra ID</w:t>
+            </w:r>
+          </w:p>
+        </w:tc>
+        <w:tc>
+          <w:tcPr>
+            <w:tcW w:type="dxa" w:w="3120"/>
+          </w:tcPr>
+          <w:p>
+            <w:r>
+              <w:rPr>
+                <w:rFonts w:ascii="Calibri" w:hAnsi="Calibri"/>
+                <w:color w:val="333333"/>
+                <w:sz w:val="20"/>
+              </w:rPr>
+              <w:t>Identity (U)</w:t>
+            </w:r>
+          </w:p>
+        </w:tc>
+        <w:tc>
+          <w:tcPr>
+            <w:tcW w:type="dxa" w:w="3120"/>
+          </w:tcPr>
+          <w:p>
+            <w:r>
+              <w:rPr>
+                <w:rFonts w:ascii="Calibri" w:hAnsi="Calibri"/>
+                <w:color w:val="333333"/>
+                <w:sz w:val="20"/>
+              </w:rPr>
+              <w:t>IA-2, IA-5</w:t>
+            </w:r>
+          </w:p>
+        </w:tc>
+      </w:tr>
+      <w:tr>
+        <w:tc>
+          <w:tcPr>
+            <w:tcW w:type="dxa" w:w="3120"/>
+          </w:tcPr>
+          <w:p>
+            <w:r>
+              <w:rPr>
+                <w:rFonts w:ascii="Calibri" w:hAnsi="Calibri"/>
+                <w:color w:val="333333"/>
+                <w:sz w:val="20"/>
+              </w:rPr>
+              <w:t>Cisco SD-WAN</w:t>
+            </w:r>
+          </w:p>
+        </w:tc>
+        <w:tc>
+          <w:tcPr>
+            <w:tcW w:type="dxa" w:w="3120"/>
+          </w:tcPr>
+          <w:p>
+            <w:r>
+              <w:rPr>
+                <w:rFonts w:ascii="Calibri" w:hAnsi="Calibri"/>
+                <w:color w:val="333333"/>
+                <w:sz w:val="20"/>
+              </w:rPr>
+              <w:t>Overlay (O)</w:t>
+            </w:r>
+          </w:p>
+        </w:tc>
+        <w:tc>
+          <w:tcPr>
+            <w:tcW w:type="dxa" w:w="3120"/>
+          </w:tcPr>
+          <w:p>
+            <w:r>
+              <w:rPr>
+                <w:rFonts w:ascii="Calibri" w:hAnsi="Calibri"/>
+                <w:color w:val="333333"/>
+                <w:sz w:val="20"/>
+              </w:rPr>
+              <w:t>SC-7, SC-8</w:t>
+            </w:r>
+          </w:p>
+        </w:tc>
+      </w:tr>
+    </w:tbl>
+    <w:p>
+      <w:pPr>
+        <w:pStyle w:val="SourceCode"/>
+      </w:pPr>
+      <w:r>
+        <w:t>quarto render --to html</w:t>
+      </w:r>
+    </w:p>
     <w:sectPr>
       <w:pgSz w:w="12240" w:h="15840"/>
-      <w:pgMar w:top="1440" w:right="1800" w:bottom="1440" w:left="1800" w:header="720" w:footer="720" w:gutter="0"/>
+      <w:pgMar w:top="1440" w:right="1440" w:bottom="1440" w:left="1440" w:header="720" w:footer="720" w:gutter="0"/>
       <w:cols w:space="720"/>
       <w:docGrid w:linePitch="360"/>
     </w:sectPr>
@@ -375,8 +597,12 @@
     <w:name w:val="Normal"/>
     <w:qFormat/>
     <w:rsid w:val="00FC693F"/>
+    <w:pPr>
+      <w:spacing w:before="0" w:after="120" w:line="276" w:lineRule="auto"/>
+    </w:pPr>
     <w:rPr>
       <w:rFonts w:ascii="Calibri" w:hAnsi="Calibri"/>
+      <w:color w:val="333333"/>
       <w:sz w:val="22"/>
     </w:rPr>
   </w:style>
@@ -435,15 +661,15 @@
     <w:pPr>
       <w:keepNext/>
       <w:keepLines/>
-      <w:spacing w:before="480" w:after="0"/>
+      <w:spacing w:before="480" w:after="240"/>
       <w:outlineLvl w:val="0"/>
     </w:pPr>
     <w:rPr>
-      <w:rFonts w:asciiTheme="majorHAnsi" w:eastAsiaTheme="majorEastAsia" w:hAnsiTheme="majorHAnsi" w:cstheme="majorBidi"/>
+      <w:rFonts w:asciiTheme="majorHAnsi" w:eastAsiaTheme="majorEastAsia" w:hAnsiTheme="majorHAnsi" w:cstheme="majorBidi" w:ascii="Calibri" w:hAnsi="Calibri"/>
       <w:b/>
       <w:bCs/>
-      <w:color w:val="003366"/>
-      <w:sz w:val="48"/>
+      <w:color w:val="003B6F"/>
+      <w:sz w:val="44"/>
       <w:szCs w:val="28"/>
     </w:rPr>
   </w:style>
@@ -459,15 +685,15 @@
     <w:pPr>
       <w:keepNext/>
       <w:keepLines/>
-      <w:spacing w:before="200" w:after="0"/>
+      <w:spacing w:before="360" w:after="160"/>
       <w:outlineLvl w:val="1"/>
     </w:pPr>
     <w:rPr>
-      <w:rFonts w:asciiTheme="majorHAnsi" w:eastAsiaTheme="majorEastAsia" w:hAnsiTheme="majorHAnsi" w:cstheme="majorBidi"/>
+      <w:rFonts w:asciiTheme="majorHAnsi" w:eastAsiaTheme="majorEastAsia" w:hAnsiTheme="majorHAnsi" w:cstheme="majorBidi" w:ascii="Calibri" w:hAnsi="Calibri"/>
       <w:b/>
       <w:bCs/>
-      <w:color w:val="003366"/>
-      <w:sz w:val="36"/>
+      <w:color w:val="003B6F"/>
+      <w:sz w:val="32"/>
       <w:szCs w:val="26"/>
     </w:rPr>
   </w:style>
@@ -483,15 +709,15 @@
     <w:pPr>
       <w:keepNext/>
       <w:keepLines/>
-      <w:spacing w:before="200" w:after="0"/>
+      <w:spacing w:before="240" w:after="120"/>
       <w:outlineLvl w:val="2"/>
     </w:pPr>
     <w:rPr>
-      <w:rFonts w:asciiTheme="majorHAnsi" w:eastAsiaTheme="majorEastAsia" w:hAnsiTheme="majorHAnsi" w:cstheme="majorBidi"/>
+      <w:rFonts w:asciiTheme="majorHAnsi" w:eastAsiaTheme="majorEastAsia" w:hAnsiTheme="majorHAnsi" w:cstheme="majorBidi" w:ascii="Calibri" w:hAnsi="Calibri"/>
       <w:b/>
       <w:bCs/>
-      <w:color w:val="003366"/>
-      <w:sz w:val="28"/>
+      <w:color w:val="1A5B8F"/>
+      <w:sz w:val="26"/>
     </w:rPr>
   </w:style>
   <w:style w:type="paragraph" w:styleId="Heading4">
@@ -507,16 +733,17 @@
     <w:pPr>
       <w:keepNext/>
       <w:keepLines/>
-      <w:spacing w:before="200" w:after="0"/>
+      <w:spacing w:before="200" w:after="80"/>
       <w:outlineLvl w:val="3"/>
     </w:pPr>
     <w:rPr>
-      <w:rFonts w:asciiTheme="majorHAnsi" w:eastAsiaTheme="majorEastAsia" w:hAnsiTheme="majorHAnsi" w:cstheme="majorBidi"/>
+      <w:rFonts w:asciiTheme="majorHAnsi" w:eastAsiaTheme="majorEastAsia" w:hAnsiTheme="majorHAnsi" w:cstheme="majorBidi" w:ascii="Calibri" w:hAnsi="Calibri"/>
       <w:b/>
       <w:bCs/>
       <w:i/>
       <w:iCs/>
-      <w:color w:val="4F81BD" w:themeColor="accent1"/>
+      <w:color w:val="2D6EA0"/>
+      <w:sz w:val="22"/>
     </w:rPr>
   </w:style>
   <w:style w:type="paragraph" w:styleId="Heading5">
@@ -532,12 +759,14 @@
     <w:pPr>
       <w:keepNext/>
       <w:keepLines/>
-      <w:spacing w:before="200" w:after="0"/>
+      <w:spacing w:before="160" w:after="80"/>
       <w:outlineLvl w:val="4"/>
     </w:pPr>
     <w:rPr>
-      <w:rFonts w:asciiTheme="majorHAnsi" w:eastAsiaTheme="majorEastAsia" w:hAnsiTheme="majorHAnsi" w:cstheme="majorBidi"/>
-      <w:color w:val="243F60" w:themeColor="accent1" w:themeShade="7F"/>
+      <w:rFonts w:asciiTheme="majorHAnsi" w:eastAsiaTheme="majorEastAsia" w:hAnsiTheme="majorHAnsi" w:cstheme="majorBidi" w:ascii="Calibri" w:hAnsi="Calibri"/>
+      <w:b/>
+      <w:color w:val="666666"/>
+      <w:sz w:val="22"/>
     </w:rPr>
   </w:style>
   <w:style w:type="paragraph" w:styleId="Heading6">
@@ -553,14 +782,16 @@
     <w:pPr>
       <w:keepNext/>
       <w:keepLines/>
-      <w:spacing w:before="200" w:after="0"/>
+      <w:spacing w:before="160" w:after="80"/>
       <w:outlineLvl w:val="5"/>
     </w:pPr>
     <w:rPr>
-      <w:rFonts w:asciiTheme="majorHAnsi" w:eastAsiaTheme="majorEastAsia" w:hAnsiTheme="majorHAnsi" w:cstheme="majorBidi"/>
+      <w:rFonts w:asciiTheme="majorHAnsi" w:eastAsiaTheme="majorEastAsia" w:hAnsiTheme="majorHAnsi" w:cstheme="majorBidi" w:ascii="Calibri" w:hAnsi="Calibri"/>
+      <w:b/>
       <w:i/>
       <w:iCs/>
-      <w:color w:val="243F60" w:themeColor="accent1" w:themeShade="7F"/>
+      <w:color w:val="666666"/>
+      <w:sz w:val="22"/>
     </w:rPr>
   </w:style>
   <w:style w:type="paragraph" w:styleId="Heading7">
@@ -725,13 +956,13 @@
       <w:pBdr>
         <w:bottom w:val="single" w:sz="8" w:space="4" w:color="4F81BD" w:themeColor="accent1"/>
       </w:pBdr>
-      <w:spacing w:after="300" w:line="240" w:lineRule="auto"/>
+      <w:spacing w:after="240" w:line="240" w:lineRule="auto" w:before="0"/>
       <w:contextualSpacing/>
     </w:pPr>
     <w:rPr>
-      <w:rFonts w:asciiTheme="majorHAnsi" w:eastAsiaTheme="majorEastAsia" w:hAnsiTheme="majorHAnsi" w:cstheme="majorBidi"/>
+      <w:rFonts w:asciiTheme="majorHAnsi" w:eastAsiaTheme="majorEastAsia" w:hAnsiTheme="majorHAnsi" w:cstheme="majorBidi" w:ascii="Calibri" w:hAnsi="Calibri"/>
       <w:b/>
-      <w:color w:val="003366"/>
+      <w:color w:val="003B6F"/>
       <w:spacing w:val="5"/>
       <w:kern w:val="28"/>
       <w:sz w:val="56"/>
@@ -765,14 +996,16 @@
       <w:numPr>
         <w:ilvl w:val="1"/>
       </w:numPr>
+      <w:spacing w:before="0" w:after="480"/>
     </w:pPr>
     <w:rPr>
-      <w:rFonts w:asciiTheme="majorHAnsi" w:eastAsiaTheme="majorEastAsia" w:hAnsiTheme="majorHAnsi" w:cstheme="majorBidi"/>
+      <w:rFonts w:asciiTheme="majorHAnsi" w:eastAsiaTheme="majorEastAsia" w:hAnsiTheme="majorHAnsi" w:cstheme="majorBidi" w:ascii="Calibri" w:hAnsi="Calibri"/>
+      <w:b w:val="0"/>
       <w:i/>
       <w:iCs/>
-      <w:color w:val="333333"/>
+      <w:color w:val="666666"/>
       <w:spacing w:val="15"/>
-      <w:sz w:val="32"/>
+      <w:sz w:val="28"/>
       <w:szCs w:val="24"/>
     </w:rPr>
   </w:style>
@@ -908,8 +1141,14 @@
       <w:numPr>
         <w:numId w:val="1"/>
       </w:numPr>
+      <w:spacing w:before="40" w:after="40"/>
       <w:contextualSpacing/>
     </w:pPr>
+    <w:rPr>
+      <w:rFonts w:ascii="Calibri" w:hAnsi="Calibri"/>
+      <w:color w:val="333333"/>
+      <w:sz w:val="22"/>
+    </w:rPr>
   </w:style>
   <w:style w:type="paragraph" w:styleId="ListBullet2">
     <w:name w:val="List Bullet 2"/>
@@ -947,8 +1186,14 @@
       <w:numPr>
         <w:numId w:val="5"/>
       </w:numPr>
+      <w:spacing w:before="40" w:after="40"/>
       <w:contextualSpacing/>
     </w:pPr>
+    <w:rPr>
+      <w:rFonts w:ascii="Calibri" w:hAnsi="Calibri"/>
+      <w:color w:val="333333"/>
+      <w:sz w:val="22"/>
+    </w:rPr>
   </w:style>
   <w:style w:type="paragraph" w:styleId="ListNumber2">
     <w:name w:val="List Number 2"/>
@@ -1172,9 +1417,11 @@
       <w:spacing w:line="240" w:lineRule="auto"/>
     </w:pPr>
     <w:rPr>
+      <w:rFonts w:ascii="Calibri" w:hAnsi="Calibri"/>
       <w:b/>
       <w:bCs/>
-      <w:color w:val="4F81BD" w:themeColor="accent1"/>
+      <w:i/>
+      <w:color w:val="666666"/>
       <w:sz w:val="18"/>
       <w:szCs w:val="18"/>
     </w:rPr>
@@ -12063,6 +12310,39 @@
         <w:shd w:val="clear" w:color="auto" w:fill="FBCAA2" w:themeFill="accent6" w:themeFillTint="7F"/>
       </w:tcPr>
     </w:tblStylePr>
+  </w:style>
+  <w:style w:type="paragraph" w:customStyle="1" w:styleId="BlockText">
+    <w:name w:val="Block Text"/>
+    <w:pPr>
+      <w:spacing w:before="120" w:after="120" w:line="276" w:lineRule="auto"/>
+      <w:ind w:left="720"/>
+    </w:pPr>
+    <w:rPr>
+      <w:rFonts w:ascii="Calibri" w:hAnsi="Calibri"/>
+      <w:i/>
+      <w:color w:val="666666"/>
+      <w:sz w:val="22"/>
+    </w:rPr>
+  </w:style>
+  <w:style w:type="paragraph" w:customStyle="1" w:styleId="SourceCode">
+    <w:name w:val="Source Code"/>
+    <w:pPr>
+      <w:spacing w:before="80" w:after="80" w:line="240" w:lineRule="auto"/>
+      <w:shd w:fill="F5F5F5" w:val="clear"/>
+    </w:pPr>
+    <w:rPr>
+      <w:rFonts w:ascii="Consolas" w:hAnsi="Consolas"/>
+      <w:color w:val="333333"/>
+      <w:sz w:val="19"/>
+    </w:rPr>
+  </w:style>
+  <w:style w:type="character" w:customStyle="1" w:styleId="Hyperlink">
+    <w:name w:val="Hyperlink"/>
+    <w:rPr>
+      <w:rFonts w:ascii="Calibri" w:hAnsi="Calibri"/>
+      <w:color w:val="0078D4"/>
+      <w:u w:val="single"/>
+    </w:rPr>
   </w:style>
 </w:styles>
 </file>

</xml_diff>